<commit_message>
Citations: note DUAA 2025 amendment + ICO vetting guidance
Folded in the two citations from the Captain's sources that are safely
knowable, at the level confidence allows:
- Ref 15 (data protection) now notes UK GDPR/DPA 2018 as amended by the
  Data Use and Access Act 2025; commencement specifics flagged pending
  verification (gov.uk guidance is egress-blocked this session).
- Ref 17 added: ICO pre-employment vetting guidance, cited from the
  Signatory ID register workflow (necessity/proportionality/minimisation).

CITATIONS.md records the blocked source domains and what still needs
verifying once they're on the allow-list or pasted. Reports regenerated
(Technical 7pp, Position 4pp).

Co-Authored-By: Claude Opus 4.8 <noreply@anthropic.com>
Claude-Session: https://claude.ai/code/session_012EFETGbhdxdnPCjpmQ9UDz
</commit_message>
<xml_diff>
--- a/Santander_Position_Paper.docx
+++ b/Santander_Position_Paper.docx
@@ -1958,7 +1958,7 @@
           <w:color w:val="1C1917"/>
           <w:sz w:val="18"/>
         </w:rPr>
-        <w:t>UK GDPR and the Data Protection Act 2018, Article 5(1)(c) — data minimisation and purpose limitation.</w:t>
+        <w:t>UK GDPR and the Data Protection Act 2018 (as amended by the Data Use and Access Act 2025), Article 5(1)(c) — data minimisation and purpose limitation.</w:t>
       </w:r>
     </w:p>
     <w:p>
@@ -1985,6 +1985,32 @@
           <w:sz w:val="18"/>
         </w:rPr>
         <w:t>W3C — Web Content Accessibility Guidelines (WCAG) 2.1, Level AA.</w:t>
+      </w:r>
+    </w:p>
+    <w:p>
+      <w:pPr>
+        <w:spacing w:after="60"/>
+        <w:ind w:left="504" w:hanging="504"/>
+      </w:pPr>
+      <w:r>
+        <w:rPr>
+          <w:rFonts w:ascii="Calibri" w:hAnsi="Calibri"/>
+          <w:b/>
+          <w:i w:val="0"/>
+          <w:color w:val="57534E"/>
+          <w:sz w:val="18"/>
+        </w:rPr>
+        <w:t xml:space="preserve">[17]  </w:t>
+      </w:r>
+      <w:r>
+        <w:rPr>
+          <w:rFonts w:ascii="Calibri" w:hAnsi="Calibri"/>
+          <w:b w:val="0"/>
+          <w:i w:val="0"/>
+          <w:color w:val="1C1917"/>
+          <w:sz w:val="18"/>
+        </w:rPr>
+        <w:t>ICO — guidance on the pre-employment vetting of candidates: necessity, proportionality and data minimisation when verifying individuals (relevant to the signatory ID register).</w:t>
       </w:r>
     </w:p>
     <w:p/>

</xml_diff>

<commit_message>
Brand: apply official red #DA291C (replaces #c8102e approximation)
Confirmed primary brand red from the portal (#DA291C). Swapped across
App.jsx (114 uses — top bar, CTAs, accents, focus rings, card visuals)
and the report builders (docx + pdf). Functional status-reds and the
gradient's #ec0000 left as-is pending confirmation. Build clean, gates
green, reports regenerated. DECISIONS.md updated; logo still needed as
actual files in brand/.

Co-Authored-By: Claude Opus 4.8 <noreply@anthropic.com>
Claude-Session: https://claude.ai/code/session_012EFETGbhdxdnPCjpmQ9UDz
</commit_message>
<xml_diff>
--- a/Santander_Position_Paper.docx
+++ b/Santander_Position_Paper.docx
@@ -14,7 +14,7 @@
           <w:rFonts w:ascii="Calibri" w:hAnsi="Calibri"/>
           <w:b/>
           <w:i w:val="0"/>
-          <w:color w:val="C8102E"/>
+          <w:color w:val="DA291C"/>
           <w:sz w:val="18"/>
         </w:rPr>
         <w:t>INTERNAL · CONFIDENTIAL</w:t>
@@ -554,7 +554,7 @@
           <w:rFonts w:ascii="Calibri" w:hAnsi="Calibri"/>
           <w:b/>
           <w:i w:val="0"/>
-          <w:color w:val="C8102E"/>
+          <w:color w:val="DA291C"/>
           <w:sz w:val="16"/>
         </w:rPr>
         <w:t>POSITION IN BRIEF</w:t>
@@ -617,7 +617,7 @@
           <w:rFonts w:ascii="Calibri" w:hAnsi="Calibri"/>
           <w:b/>
           <w:i w:val="0"/>
-          <w:color w:val="C8102E"/>
+          <w:color w:val="DA291C"/>
           <w:sz w:val="16"/>
         </w:rPr>
         <w:t>THE PROBLEM</w:t>
@@ -729,7 +729,7 @@
           <w:rFonts w:ascii="Calibri" w:hAnsi="Calibri"/>
           <w:b/>
           <w:i w:val="0"/>
-          <w:color w:val="C8102E"/>
+          <w:color w:val="DA291C"/>
           <w:sz w:val="16"/>
         </w:rPr>
         <w:t>THE OPPORTUNITY</w:t>
@@ -795,7 +795,7 @@
                 <w:rFonts w:ascii="Calibri" w:hAnsi="Calibri"/>
                 <w:b/>
                 <w:i w:val="0"/>
-                <w:color w:val="C8102E"/>
+                <w:color w:val="DA291C"/>
                 <w:sz w:val="17"/>
               </w:rPr>
               <w:t xml:space="preserve">THE REFRAMING  </w:t>
@@ -833,7 +833,7 @@
           <w:rFonts w:ascii="Calibri" w:hAnsi="Calibri"/>
           <w:b/>
           <w:i w:val="0"/>
-          <w:color w:val="C8102E"/>
+          <w:color w:val="DA291C"/>
           <w:sz w:val="16"/>
         </w:rPr>
         <w:t>WHY NOW</w:t>
@@ -929,7 +929,7 @@
           <w:rFonts w:ascii="Calibri" w:hAnsi="Calibri"/>
           <w:b/>
           <w:i w:val="0"/>
-          <w:color w:val="C8102E"/>
+          <w:color w:val="DA291C"/>
           <w:sz w:val="16"/>
         </w:rPr>
         <w:t>EVIDENCE</w:t>
@@ -977,7 +977,7 @@
           <w:rFonts w:ascii="Calibri" w:hAnsi="Calibri"/>
           <w:b/>
           <w:i w:val="0"/>
-          <w:color w:val="C8102E"/>
+          <w:color w:val="DA291C"/>
           <w:sz w:val="16"/>
         </w:rPr>
         <w:t>BENEFITS</w:t>
@@ -1188,7 +1188,7 @@
           <w:rFonts w:ascii="Calibri" w:hAnsi="Calibri"/>
           <w:b/>
           <w:i w:val="0"/>
-          <w:color w:val="C8102E"/>
+          <w:color w:val="DA291C"/>
           <w:sz w:val="16"/>
         </w:rPr>
         <w:t>RISKS</w:t>
@@ -1435,7 +1435,7 @@
           <w:rFonts w:ascii="Calibri" w:hAnsi="Calibri"/>
           <w:b/>
           <w:i w:val="0"/>
-          <w:color w:val="C8102E"/>
+          <w:color w:val="DA291C"/>
           <w:sz w:val="16"/>
         </w:rPr>
         <w:t>RECOMMENDATION</w:t>
@@ -1547,7 +1547,7 @@
           <w:rFonts w:ascii="Calibri" w:hAnsi="Calibri"/>
           <w:b/>
           <w:i w:val="0"/>
-          <w:color w:val="C8102E"/>
+          <w:color w:val="DA291C"/>
           <w:sz w:val="16"/>
         </w:rPr>
         <w:t>REFERENCES</w:t>
@@ -2096,7 +2096,7 @@
     <w:r>
       <w:rPr>
         <w:b/>
-        <w:color w:val="C8102E"/>
+        <w:color w:val="DA291C"/>
         <w:sz w:val="15"/>
       </w:rPr>
       <w:tab/>

</xml_diff>

<commit_message>
Brand: put official logo on the report covers
Rasterised the logo SVGs to transparent PNGs (3000x519, via headless
Chromium) since docx/pptx can't embed SVG, and placed the red logo at the
top of both report covers (docx + pdf builders). Reports regenerated
(Technical 7pp, Position 4pp), cover verified. DECISIONS.md updated:
logo now applied to app header + report covers; decks to follow on next
rebuild.

Co-Authored-By: Claude Opus 4.8 <noreply@anthropic.com>
Claude-Session: https://claude.ai/code/session_012EFETGbhdxdnPCjpmQ9UDz
</commit_message>
<xml_diff>
--- a/Santander_Position_Paper.docx
+++ b/Santander_Position_Paper.docx
@@ -3,6 +3,45 @@
 <w:document xmlns:wpc="http://schemas.microsoft.com/office/word/2010/wordprocessingCanvas" xmlns:mo="http://schemas.microsoft.com/office/mac/office/2008/main" xmlns:mc="http://schemas.openxmlformats.org/markup-compatibility/2006" xmlns:mv="urn:schemas-microsoft-com:mac:vml" xmlns:o="urn:schemas-microsoft-com:office:office" xmlns:r="http://schemas.openxmlformats.org/officeDocument/2006/relationships" xmlns:m="http://schemas.openxmlformats.org/officeDocument/2006/math" xmlns:v="urn:schemas-microsoft-com:vml" xmlns:wp14="http://schemas.microsoft.com/office/word/2010/wordprocessingDrawing" xmlns:wp="http://schemas.openxmlformats.org/drawingml/2006/wordprocessingDrawing" xmlns:w10="urn:schemas-microsoft-com:office:word" xmlns:w="http://schemas.openxmlformats.org/wordprocessingml/2006/main" xmlns:w14="http://schemas.microsoft.com/office/word/2010/wordml" xmlns:wpg="http://schemas.microsoft.com/office/word/2010/wordprocessingGroup" xmlns:wpi="http://schemas.microsoft.com/office/word/2010/wordprocessingInk" xmlns:wne="http://schemas.microsoft.com/office/word/2006/wordml" xmlns:wps="http://schemas.microsoft.com/office/word/2010/wordprocessingShape" mc:Ignorable="w14 wp14">
   <w:body>
     <w:p/>
+    <w:p>
+      <w:pPr>
+        <w:spacing w:after="80"/>
+      </w:pPr>
+      <w:r>
+        <w:drawing>
+          <wp:inline xmlns:a="http://schemas.openxmlformats.org/drawingml/2006/main" xmlns:pic="http://schemas.openxmlformats.org/drawingml/2006/picture">
+            <wp:extent cx="1737360" cy="300563"/>
+            <wp:docPr id="1" name="Picture 1"/>
+            <wp:cNvGraphicFramePr>
+              <a:graphicFrameLocks noChangeAspect="1"/>
+            </wp:cNvGraphicFramePr>
+            <a:graphic>
+              <a:graphicData uri="http://schemas.openxmlformats.org/drawingml/2006/picture">
+                <pic:pic>
+                  <pic:nvPicPr>
+                    <pic:cNvPr id="0" name="santander-logo-red.png"/>
+                    <pic:cNvPicPr/>
+                  </pic:nvPicPr>
+                  <pic:blipFill>
+                    <a:blip r:embed="rId11"/>
+                    <a:stretch>
+                      <a:fillRect/>
+                    </a:stretch>
+                  </pic:blipFill>
+                  <pic:spPr>
+                    <a:xfrm>
+                      <a:off x="0" y="0"/>
+                      <a:ext cx="1737360" cy="300563"/>
+                    </a:xfrm>
+                    <a:prstGeom prst="rect"/>
+                  </pic:spPr>
+                </pic:pic>
+              </a:graphicData>
+            </a:graphic>
+          </wp:inline>
+        </w:drawing>
+      </w:r>
+    </w:p>
     <w:p/>
     <w:p/>
     <w:p>

</xml_diff>